<commit_message>
fix(bios): extract Saouma's role via cosmetic transform, not regex
Saouma's intro phrased the life sentence as a new sentence
("…(FAO) 1976-1993. He was born…") instead of the house-style comma
clause ("…1976-1993, was born…"). parseIntro's SUMMARY_RE needs the
comma form, so the summary — and therefore the role — went unparsed.

Fixed at the source to keep the corpus coherent (same approach as the
existing Bonnet-H clause-swap transform) rather than loosening the
parser:

- bios-transforms.ts: add Saouma-E 2013 transform
  "(FAO) 1976-1993. He was born" → "(FAO) 1976-1993, was born"
- process-bios.ts: applyTransform now reads/rewrites the PROCESSED_DIR
  copy instead of SOURCE_DIR. Transforms run after .doc→.docx
  conversion, so this unblocks transforms for the 5 legacy .doc entries
  (Ismay, Mayor, Saouma, Unckel, Van Heuven Goedhart) whose binary
  source can't be unzipped.

Saouma now resolves to Director-General (sixth) of FAO, 1976-1993.
All 31 parser tests pass.
</commit_message>
<xml_diff>
--- a/src/content/bios-processed/Saouma-E 2013.docx
+++ b/src/content/bios-processed/Saouma-E 2013.docx
@@ -13,12 +13,7 @@
         </w:rPr>
       </w:pPr>
       <w:r>
-        <w:rPr>
-          <w:b/>
-          <w:sz w:val="24"/>
-          <w:szCs w:val="24"/>
-        </w:rPr>
-        <w:t>SAOUMA, Edouard Victor, agronomist and sixth Director-General of the Food and Agriculture Organization of the United Nations (FAO) 1976-1993. He was born 6 November 1926 in Beirut, Lebanon, and died there on 1 December 2012. He was the son of Victor Youssef Saouma, trader in nutritive products, and Evelyne Tyan. In 1951 he married Ines Forero-Ramos. They had two daughters and one son.</w:t>
+        <w:t xml:space="preserve">SAOUMA, Edouard Victor, agronomist and sixth Director-General of the Food and Agriculture Organization of the United Nations (FAO) 1976-1993, was born 6 November 1926 in Beirut, Lebanon, and died there on 1 December 2012. He was the son of Victor Youssef Saouma, trader in nutritive products, and Evelyne Tyan. In 1951 he married Ines Forero-Ramos. They had two daughters and one son.</w:t>
       </w:r>
     </w:p>
     <w:p>

</xml_diff>